<commit_message>
Vorlagen: Briefkopf und Logo im Homepage-Stil
Co-Authored-By: Claude Opus 5.5 <noreply@anthropic.com>
Claude-Session: https://claude.ai/code/session_01HFV2re9ycCdfTrj4WougqA
</commit_message>
<xml_diff>
--- a/Vorlagen/Fundbrueder-AI-Briefkopf.docx
+++ b/Vorlagen/Fundbrueder-AI-Briefkopf.docx
@@ -52,7 +52,7 @@
                 <w:color w:val="55657F"/>
                 <w:sz w:val="14"/>
               </w:rPr>
-              <w:t>Fundbrüder AI · Görlitzer Straße 19 · 78052 Villingen-Schwenningen</w:t>
+              <w:t>Niels Lorenz · Görlitzer Straße 19 · 78052 Villingen-Schwenningen</w:t>
             </w:r>
           </w:p>
           <w:p>
@@ -127,7 +127,31 @@
                 <w:sz w:val="18"/>
               </w:rPr>
               <w:tab/>
-              <w:t>{{NAME}}</w:t>
+              <w:t>Niels Lorenz</w:t>
+            </w:r>
+          </w:p>
+          <w:p>
+            <w:pPr>
+              <w:tabs>
+                <w:tab w:pos="1531" w:val="left"/>
+              </w:tabs>
+              <w:spacing w:line="264" w:lineRule="auto"/>
+            </w:pPr>
+            <w:r>
+              <w:rPr>
+                <w:b w:val="0"/>
+                <w:color w:val="55657F"/>
+                <w:sz w:val="17"/>
+              </w:rPr>
+            </w:r>
+            <w:r>
+              <w:rPr>
+                <w:b w:val="0"/>
+                <w:color w:val="1B2433"/>
+                <w:sz w:val="18"/>
+              </w:rPr>
+              <w:tab/>
+              <w:t>Louis Lorenz</w:t>
             </w:r>
           </w:p>
           <w:p>
@@ -434,7 +458,7 @@
               <w:color w:val="0A1530"/>
               <w:sz w:val="15"/>
             </w:rPr>
-            <w:t>Fundbrüder AI</w:t>
+            <w:t>Fundbrüder GbR</w:t>
           </w:r>
         </w:p>
         <w:p>
@@ -447,7 +471,7 @@
               <w:color w:val="55657F"/>
               <w:sz w:val="15"/>
             </w:rPr>
-            <w:t>Fundbrüder GbR</w:t>
+            <w:t>c/o Niels Lorenz</w:t>
           </w:r>
         </w:p>
         <w:p>
@@ -668,7 +692,7 @@
               <w:color w:val="0A1530"/>
               <w:sz w:val="15"/>
             </w:rPr>
-            <w:t>Fundbrüder AI</w:t>
+            <w:t>Fundbrüder GbR</w:t>
           </w:r>
         </w:p>
         <w:p>
@@ -681,7 +705,7 @@
               <w:color w:val="55657F"/>
               <w:sz w:val="15"/>
             </w:rPr>
-            <w:t>Fundbrüder GbR</w:t>
+            <w:t>c/o Niels Lorenz</w:t>
           </w:r>
         </w:p>
         <w:p>
@@ -832,7 +856,7 @@
     <w:r>
       <w:drawing>
         <wp:inline xmlns:a="http://schemas.openxmlformats.org/drawingml/2006/main" xmlns:pic="http://schemas.openxmlformats.org/drawingml/2006/picture">
-          <wp:extent cx="2923200" cy="630000"/>
+          <wp:extent cx="2759400" cy="630000"/>
           <wp:docPr id="1" name="Picture 1"/>
           <wp:cNvGraphicFramePr>
             <a:graphicFrameLocks noChangeAspect="1"/>
@@ -853,7 +877,7 @@
                 <pic:spPr>
                   <a:xfrm>
                     <a:off x="0" y="0"/>
-                    <a:ext cx="2923200" cy="630000"/>
+                    <a:ext cx="2759400" cy="630000"/>
                   </a:xfrm>
                   <a:prstGeom prst="rect"/>
                 </pic:spPr>
@@ -961,15 +985,7 @@
         <w:color w:val="FF8A2B"/>
         <w:sz w:val="20"/>
       </w:rPr>
-      <w:t>A</w:t>
-    </w:r>
-    <w:r>
-      <w:rPr>
-        <w:b/>
-        <w:color w:val="2E8BFF"/>
-        <w:sz w:val="20"/>
-      </w:rPr>
-      <w:t>I</w:t>
+      <w:t>AI</w:t>
     </w:r>
     <w:r>
       <w:rPr>

</xml_diff>